<commit_message>
handoff(115): docx refreshed (#325 round 5, copy sweep backlog)
</commit_message>
<xml_diff>
--- a/handoffs/op-115/TGP-Operator-Handoff-Agent-115.docx
+++ b/handoffs/op-115/TGP-Operator-Handoff-Agent-115.docx
@@ -3303,12 +3303,12 @@
         </w:tblBorders>
       </w:tblPr>
       <w:tblGrid>
-        <w:gridCol w:w="1705"/>
-        <w:gridCol w:w="1513"/>
-        <w:gridCol w:w="1246"/>
-        <w:gridCol w:w="1221"/>
-        <w:gridCol w:w="2864"/>
-        <w:gridCol w:w="1531"/>
+        <w:gridCol w:w="1707"/>
+        <w:gridCol w:w="1515"/>
+        <w:gridCol w:w="1235"/>
+        <w:gridCol w:w="1222"/>
+        <w:gridCol w:w="2868"/>
+        <w:gridCol w:w="1533"/>
       </w:tblGrid>
       <w:tr>
         <w:trPr>
@@ -3316,7 +3316,7 @@
         </w:trPr>
         <w:tc>
           <w:tcPr>
-            <w:tcW w:type="dxa" w:w="1705"/>
+            <w:tcW w:type="dxa" w:w="1707"/>
             <w:tcBorders>
               <w:top w:val="single" w:color="C8C5BE" w:sz="1"/>
               <w:left w:val="single" w:color="C8C5BE" w:sz="1"/>
@@ -3345,7 +3345,7 @@
         </w:tc>
         <w:tc>
           <w:tcPr>
-            <w:tcW w:type="dxa" w:w="1513"/>
+            <w:tcW w:type="dxa" w:w="1515"/>
             <w:tcBorders>
               <w:top w:val="single" w:color="C8C5BE" w:sz="1"/>
               <w:left w:val="single" w:color="C8C5BE" w:sz="1"/>
@@ -3374,7 +3374,7 @@
         </w:tc>
         <w:tc>
           <w:tcPr>
-            <w:tcW w:type="dxa" w:w="1246"/>
+            <w:tcW w:type="dxa" w:w="1235"/>
             <w:tcBorders>
               <w:top w:val="single" w:color="C8C5BE" w:sz="1"/>
               <w:left w:val="single" w:color="C8C5BE" w:sz="1"/>
@@ -3403,7 +3403,7 @@
         </w:tc>
         <w:tc>
           <w:tcPr>
-            <w:tcW w:type="dxa" w:w="1221"/>
+            <w:tcW w:type="dxa" w:w="1222"/>
             <w:tcBorders>
               <w:top w:val="single" w:color="C8C5BE" w:sz="1"/>
               <w:left w:val="single" w:color="C8C5BE" w:sz="1"/>
@@ -3432,7 +3432,7 @@
         </w:tc>
         <w:tc>
           <w:tcPr>
-            <w:tcW w:type="dxa" w:w="2864"/>
+            <w:tcW w:type="dxa" w:w="2868"/>
             <w:tcBorders>
               <w:top w:val="single" w:color="C8C5BE" w:sz="1"/>
               <w:left w:val="single" w:color="C8C5BE" w:sz="1"/>
@@ -3461,7 +3461,7 @@
         </w:tc>
         <w:tc>
           <w:tcPr>
-            <w:tcW w:type="dxa" w:w="1531"/>
+            <w:tcW w:type="dxa" w:w="1533"/>
             <w:tcBorders>
               <w:top w:val="single" w:color="C8C5BE" w:sz="1"/>
               <w:left w:val="single" w:color="C8C5BE" w:sz="1"/>
@@ -3495,7 +3495,7 @@
         </w:trPr>
         <w:tc>
           <w:tcPr>
-            <w:tcW w:type="dxa" w:w="1705"/>
+            <w:tcW w:type="dxa" w:w="1707"/>
             <w:tcBorders>
               <w:top w:val="single" w:color="C8C5BE" w:sz="1"/>
               <w:left w:val="single" w:color="C8C5BE" w:sz="1"/>
@@ -3521,7 +3521,7 @@
         </w:tc>
         <w:tc>
           <w:tcPr>
-            <w:tcW w:type="dxa" w:w="1513"/>
+            <w:tcW w:type="dxa" w:w="1515"/>
             <w:tcBorders>
               <w:top w:val="single" w:color="C8C5BE" w:sz="1"/>
               <w:left w:val="single" w:color="C8C5BE" w:sz="1"/>
@@ -3547,7 +3547,7 @@
         </w:tc>
         <w:tc>
           <w:tcPr>
-            <w:tcW w:type="dxa" w:w="1246"/>
+            <w:tcW w:type="dxa" w:w="1235"/>
             <w:tcBorders>
               <w:top w:val="single" w:color="C8C5BE" w:sz="1"/>
               <w:left w:val="single" w:color="C8C5BE" w:sz="1"/>
@@ -3573,7 +3573,7 @@
         </w:tc>
         <w:tc>
           <w:tcPr>
-            <w:tcW w:type="dxa" w:w="1221"/>
+            <w:tcW w:type="dxa" w:w="1222"/>
             <w:tcBorders>
               <w:top w:val="single" w:color="C8C5BE" w:sz="1"/>
               <w:left w:val="single" w:color="C8C5BE" w:sz="1"/>
@@ -3599,7 +3599,7 @@
         </w:tc>
         <w:tc>
           <w:tcPr>
-            <w:tcW w:type="dxa" w:w="2864"/>
+            <w:tcW w:type="dxa" w:w="2868"/>
             <w:tcBorders>
               <w:top w:val="single" w:color="C8C5BE" w:sz="1"/>
               <w:left w:val="single" w:color="C8C5BE" w:sz="1"/>
@@ -3625,7 +3625,7 @@
         </w:tc>
         <w:tc>
           <w:tcPr>
-            <w:tcW w:type="dxa" w:w="1531"/>
+            <w:tcW w:type="dxa" w:w="1533"/>
             <w:tcBorders>
               <w:top w:val="single" w:color="C8C5BE" w:sz="1"/>
               <w:left w:val="single" w:color="C8C5BE" w:sz="1"/>
@@ -3656,7 +3656,7 @@
         </w:trPr>
         <w:tc>
           <w:tcPr>
-            <w:tcW w:type="dxa" w:w="1705"/>
+            <w:tcW w:type="dxa" w:w="1707"/>
             <w:tcBorders>
               <w:top w:val="single" w:color="C8C5BE" w:sz="1"/>
               <w:left w:val="single" w:color="C8C5BE" w:sz="1"/>
@@ -3682,7 +3682,7 @@
         </w:tc>
         <w:tc>
           <w:tcPr>
-            <w:tcW w:type="dxa" w:w="1513"/>
+            <w:tcW w:type="dxa" w:w="1515"/>
             <w:tcBorders>
               <w:top w:val="single" w:color="C8C5BE" w:sz="1"/>
               <w:left w:val="single" w:color="C8C5BE" w:sz="1"/>
@@ -3708,7 +3708,7 @@
         </w:tc>
         <w:tc>
           <w:tcPr>
-            <w:tcW w:type="dxa" w:w="1246"/>
+            <w:tcW w:type="dxa" w:w="1235"/>
             <w:tcBorders>
               <w:top w:val="single" w:color="C8C5BE" w:sz="1"/>
               <w:left w:val="single" w:color="C8C5BE" w:sz="1"/>
@@ -3734,7 +3734,7 @@
         </w:tc>
         <w:tc>
           <w:tcPr>
-            <w:tcW w:type="dxa" w:w="1221"/>
+            <w:tcW w:type="dxa" w:w="1222"/>
             <w:tcBorders>
               <w:top w:val="single" w:color="C8C5BE" w:sz="1"/>
               <w:left w:val="single" w:color="C8C5BE" w:sz="1"/>
@@ -3760,7 +3760,7 @@
         </w:tc>
         <w:tc>
           <w:tcPr>
-            <w:tcW w:type="dxa" w:w="2864"/>
+            <w:tcW w:type="dxa" w:w="2868"/>
             <w:tcBorders>
               <w:top w:val="single" w:color="C8C5BE" w:sz="1"/>
               <w:left w:val="single" w:color="C8C5BE" w:sz="1"/>
@@ -3786,7 +3786,7 @@
         </w:tc>
         <w:tc>
           <w:tcPr>
-            <w:tcW w:type="dxa" w:w="1531"/>
+            <w:tcW w:type="dxa" w:w="1533"/>
             <w:tcBorders>
               <w:top w:val="single" w:color="C8C5BE" w:sz="1"/>
               <w:left w:val="single" w:color="C8C5BE" w:sz="1"/>
@@ -3817,7 +3817,7 @@
         </w:trPr>
         <w:tc>
           <w:tcPr>
-            <w:tcW w:type="dxa" w:w="1705"/>
+            <w:tcW w:type="dxa" w:w="1707"/>
             <w:tcBorders>
               <w:top w:val="single" w:color="C8C5BE" w:sz="1"/>
               <w:left w:val="single" w:color="C8C5BE" w:sz="1"/>
@@ -3843,7 +3843,7 @@
         </w:tc>
         <w:tc>
           <w:tcPr>
-            <w:tcW w:type="dxa" w:w="1513"/>
+            <w:tcW w:type="dxa" w:w="1515"/>
             <w:tcBorders>
               <w:top w:val="single" w:color="C8C5BE" w:sz="1"/>
               <w:left w:val="single" w:color="C8C5BE" w:sz="1"/>
@@ -3869,7 +3869,7 @@
         </w:tc>
         <w:tc>
           <w:tcPr>
-            <w:tcW w:type="dxa" w:w="1246"/>
+            <w:tcW w:type="dxa" w:w="1235"/>
             <w:tcBorders>
               <w:top w:val="single" w:color="C8C5BE" w:sz="1"/>
               <w:left w:val="single" w:color="C8C5BE" w:sz="1"/>
@@ -3895,7 +3895,7 @@
         </w:tc>
         <w:tc>
           <w:tcPr>
-            <w:tcW w:type="dxa" w:w="1221"/>
+            <w:tcW w:type="dxa" w:w="1222"/>
             <w:tcBorders>
               <w:top w:val="single" w:color="C8C5BE" w:sz="1"/>
               <w:left w:val="single" w:color="C8C5BE" w:sz="1"/>
@@ -3921,7 +3921,7 @@
         </w:tc>
         <w:tc>
           <w:tcPr>
-            <w:tcW w:type="dxa" w:w="2864"/>
+            <w:tcW w:type="dxa" w:w="2868"/>
             <w:tcBorders>
               <w:top w:val="single" w:color="C8C5BE" w:sz="1"/>
               <w:left w:val="single" w:color="C8C5BE" w:sz="1"/>
@@ -3947,7 +3947,7 @@
         </w:tc>
         <w:tc>
           <w:tcPr>
-            <w:tcW w:type="dxa" w:w="1531"/>
+            <w:tcW w:type="dxa" w:w="1533"/>
             <w:tcBorders>
               <w:top w:val="single" w:color="C8C5BE" w:sz="1"/>
               <w:left w:val="single" w:color="C8C5BE" w:sz="1"/>
@@ -3978,7 +3978,7 @@
         </w:trPr>
         <w:tc>
           <w:tcPr>
-            <w:tcW w:type="dxa" w:w="1705"/>
+            <w:tcW w:type="dxa" w:w="1707"/>
             <w:tcBorders>
               <w:top w:val="single" w:color="C8C5BE" w:sz="1"/>
               <w:left w:val="single" w:color="C8C5BE" w:sz="1"/>
@@ -4004,7 +4004,7 @@
         </w:tc>
         <w:tc>
           <w:tcPr>
-            <w:tcW w:type="dxa" w:w="1513"/>
+            <w:tcW w:type="dxa" w:w="1515"/>
             <w:tcBorders>
               <w:top w:val="single" w:color="C8C5BE" w:sz="1"/>
               <w:left w:val="single" w:color="C8C5BE" w:sz="1"/>
@@ -4030,7 +4030,7 @@
         </w:tc>
         <w:tc>
           <w:tcPr>
-            <w:tcW w:type="dxa" w:w="1246"/>
+            <w:tcW w:type="dxa" w:w="1235"/>
             <w:tcBorders>
               <w:top w:val="single" w:color="C8C5BE" w:sz="1"/>
               <w:left w:val="single" w:color="C8C5BE" w:sz="1"/>
@@ -4056,7 +4056,7 @@
         </w:tc>
         <w:tc>
           <w:tcPr>
-            <w:tcW w:type="dxa" w:w="1221"/>
+            <w:tcW w:type="dxa" w:w="1222"/>
             <w:tcBorders>
               <w:top w:val="single" w:color="C8C5BE" w:sz="1"/>
               <w:left w:val="single" w:color="C8C5BE" w:sz="1"/>
@@ -4082,7 +4082,7 @@
         </w:tc>
         <w:tc>
           <w:tcPr>
-            <w:tcW w:type="dxa" w:w="2864"/>
+            <w:tcW w:type="dxa" w:w="2868"/>
             <w:tcBorders>
               <w:top w:val="single" w:color="C8C5BE" w:sz="1"/>
               <w:left w:val="single" w:color="C8C5BE" w:sz="1"/>
@@ -4108,7 +4108,7 @@
         </w:tc>
         <w:tc>
           <w:tcPr>
-            <w:tcW w:type="dxa" w:w="1531"/>
+            <w:tcW w:type="dxa" w:w="1533"/>
             <w:tcBorders>
               <w:top w:val="single" w:color="C8C5BE" w:sz="1"/>
               <w:left w:val="single" w:color="C8C5BE" w:sz="1"/>
@@ -4139,7 +4139,7 @@
         </w:trPr>
         <w:tc>
           <w:tcPr>
-            <w:tcW w:type="dxa" w:w="1705"/>
+            <w:tcW w:type="dxa" w:w="1707"/>
             <w:tcBorders>
               <w:top w:val="single" w:color="C8C5BE" w:sz="1"/>
               <w:left w:val="single" w:color="C8C5BE" w:sz="1"/>
@@ -4165,7 +4165,7 @@
         </w:tc>
         <w:tc>
           <w:tcPr>
-            <w:tcW w:type="dxa" w:w="1513"/>
+            <w:tcW w:type="dxa" w:w="1515"/>
             <w:tcBorders>
               <w:top w:val="single" w:color="C8C5BE" w:sz="1"/>
               <w:left w:val="single" w:color="C8C5BE" w:sz="1"/>
@@ -4191,7 +4191,7 @@
         </w:tc>
         <w:tc>
           <w:tcPr>
-            <w:tcW w:type="dxa" w:w="1246"/>
+            <w:tcW w:type="dxa" w:w="1235"/>
             <w:tcBorders>
               <w:top w:val="single" w:color="C8C5BE" w:sz="1"/>
               <w:left w:val="single" w:color="C8C5BE" w:sz="1"/>
@@ -4217,7 +4217,7 @@
         </w:tc>
         <w:tc>
           <w:tcPr>
-            <w:tcW w:type="dxa" w:w="1221"/>
+            <w:tcW w:type="dxa" w:w="1222"/>
             <w:tcBorders>
               <w:top w:val="single" w:color="C8C5BE" w:sz="1"/>
               <w:left w:val="single" w:color="C8C5BE" w:sz="1"/>
@@ -4243,7 +4243,7 @@
         </w:tc>
         <w:tc>
           <w:tcPr>
-            <w:tcW w:type="dxa" w:w="2864"/>
+            <w:tcW w:type="dxa" w:w="2868"/>
             <w:tcBorders>
               <w:top w:val="single" w:color="C8C5BE" w:sz="1"/>
               <w:left w:val="single" w:color="C8C5BE" w:sz="1"/>
@@ -4269,7 +4269,7 @@
         </w:tc>
         <w:tc>
           <w:tcPr>
-            <w:tcW w:type="dxa" w:w="1531"/>
+            <w:tcW w:type="dxa" w:w="1533"/>
             <w:tcBorders>
               <w:top w:val="single" w:color="C8C5BE" w:sz="1"/>
               <w:left w:val="single" w:color="C8C5BE" w:sz="1"/>
@@ -4300,7 +4300,7 @@
         </w:trPr>
         <w:tc>
           <w:tcPr>
-            <w:tcW w:type="dxa" w:w="1705"/>
+            <w:tcW w:type="dxa" w:w="1707"/>
             <w:tcBorders>
               <w:top w:val="single" w:color="C8C5BE" w:sz="1"/>
               <w:left w:val="single" w:color="C8C5BE" w:sz="1"/>
@@ -4326,7 +4326,7 @@
         </w:tc>
         <w:tc>
           <w:tcPr>
-            <w:tcW w:type="dxa" w:w="1513"/>
+            <w:tcW w:type="dxa" w:w="1515"/>
             <w:tcBorders>
               <w:top w:val="single" w:color="C8C5BE" w:sz="1"/>
               <w:left w:val="single" w:color="C8C5BE" w:sz="1"/>
@@ -4352,7 +4352,7 @@
         </w:tc>
         <w:tc>
           <w:tcPr>
-            <w:tcW w:type="dxa" w:w="1246"/>
+            <w:tcW w:type="dxa" w:w="1235"/>
             <w:tcBorders>
               <w:top w:val="single" w:color="C8C5BE" w:sz="1"/>
               <w:left w:val="single" w:color="C8C5BE" w:sz="1"/>
@@ -4378,7 +4378,7 @@
         </w:tc>
         <w:tc>
           <w:tcPr>
-            <w:tcW w:type="dxa" w:w="1221"/>
+            <w:tcW w:type="dxa" w:w="1222"/>
             <w:tcBorders>
               <w:top w:val="single" w:color="C8C5BE" w:sz="1"/>
               <w:left w:val="single" w:color="C8C5BE" w:sz="1"/>
@@ -4404,7 +4404,7 @@
         </w:tc>
         <w:tc>
           <w:tcPr>
-            <w:tcW w:type="dxa" w:w="2864"/>
+            <w:tcW w:type="dxa" w:w="2868"/>
             <w:tcBorders>
               <w:top w:val="single" w:color="C8C5BE" w:sz="1"/>
               <w:left w:val="single" w:color="C8C5BE" w:sz="1"/>
@@ -4430,7 +4430,7 @@
         </w:tc>
         <w:tc>
           <w:tcPr>
-            <w:tcW w:type="dxa" w:w="1531"/>
+            <w:tcW w:type="dxa" w:w="1533"/>
             <w:tcBorders>
               <w:top w:val="single" w:color="C8C5BE" w:sz="1"/>
               <w:left w:val="single" w:color="C8C5BE" w:sz="1"/>
@@ -4461,7 +4461,7 @@
         </w:trPr>
         <w:tc>
           <w:tcPr>
-            <w:tcW w:type="dxa" w:w="1705"/>
+            <w:tcW w:type="dxa" w:w="1707"/>
             <w:tcBorders>
               <w:top w:val="single" w:color="C8C5BE" w:sz="1"/>
               <w:left w:val="single" w:color="C8C5BE" w:sz="1"/>
@@ -4487,7 +4487,7 @@
         </w:tc>
         <w:tc>
           <w:tcPr>
-            <w:tcW w:type="dxa" w:w="1513"/>
+            <w:tcW w:type="dxa" w:w="1515"/>
             <w:tcBorders>
               <w:top w:val="single" w:color="C8C5BE" w:sz="1"/>
               <w:left w:val="single" w:color="C8C5BE" w:sz="1"/>
@@ -4513,7 +4513,7 @@
         </w:tc>
         <w:tc>
           <w:tcPr>
-            <w:tcW w:type="dxa" w:w="1246"/>
+            <w:tcW w:type="dxa" w:w="1235"/>
             <w:tcBorders>
               <w:top w:val="single" w:color="C8C5BE" w:sz="1"/>
               <w:left w:val="single" w:color="C8C5BE" w:sz="1"/>
@@ -4539,7 +4539,7 @@
         </w:tc>
         <w:tc>
           <w:tcPr>
-            <w:tcW w:type="dxa" w:w="1221"/>
+            <w:tcW w:type="dxa" w:w="1222"/>
             <w:tcBorders>
               <w:top w:val="single" w:color="C8C5BE" w:sz="1"/>
               <w:left w:val="single" w:color="C8C5BE" w:sz="1"/>
@@ -4565,7 +4565,7 @@
         </w:tc>
         <w:tc>
           <w:tcPr>
-            <w:tcW w:type="dxa" w:w="2864"/>
+            <w:tcW w:type="dxa" w:w="2868"/>
             <w:tcBorders>
               <w:top w:val="single" w:color="C8C5BE" w:sz="1"/>
               <w:left w:val="single" w:color="C8C5BE" w:sz="1"/>
@@ -4591,7 +4591,7 @@
         </w:tc>
         <w:tc>
           <w:tcPr>
-            <w:tcW w:type="dxa" w:w="1531"/>
+            <w:tcW w:type="dxa" w:w="1533"/>
             <w:tcBorders>
               <w:top w:val="single" w:color="C8C5BE" w:sz="1"/>
               <w:left w:val="single" w:color="C8C5BE" w:sz="1"/>
@@ -4622,7 +4622,7 @@
         </w:trPr>
         <w:tc>
           <w:tcPr>
-            <w:tcW w:type="dxa" w:w="1705"/>
+            <w:tcW w:type="dxa" w:w="1707"/>
             <w:tcBorders>
               <w:top w:val="single" w:color="C8C5BE" w:sz="1"/>
               <w:left w:val="single" w:color="C8C5BE" w:sz="1"/>
@@ -4648,7 +4648,7 @@
         </w:tc>
         <w:tc>
           <w:tcPr>
-            <w:tcW w:type="dxa" w:w="1513"/>
+            <w:tcW w:type="dxa" w:w="1515"/>
             <w:tcBorders>
               <w:top w:val="single" w:color="C8C5BE" w:sz="1"/>
               <w:left w:val="single" w:color="C8C5BE" w:sz="1"/>
@@ -4674,7 +4674,7 @@
         </w:tc>
         <w:tc>
           <w:tcPr>
-            <w:tcW w:type="dxa" w:w="1246"/>
+            <w:tcW w:type="dxa" w:w="1235"/>
             <w:tcBorders>
               <w:top w:val="single" w:color="C8C5BE" w:sz="1"/>
               <w:left w:val="single" w:color="C8C5BE" w:sz="1"/>
@@ -4700,7 +4700,7 @@
         </w:tc>
         <w:tc>
           <w:tcPr>
-            <w:tcW w:type="dxa" w:w="1221"/>
+            <w:tcW w:type="dxa" w:w="1222"/>
             <w:tcBorders>
               <w:top w:val="single" w:color="C8C5BE" w:sz="1"/>
               <w:left w:val="single" w:color="C8C5BE" w:sz="1"/>
@@ -4726,7 +4726,7 @@
         </w:tc>
         <w:tc>
           <w:tcPr>
-            <w:tcW w:type="dxa" w:w="2864"/>
+            <w:tcW w:type="dxa" w:w="2868"/>
             <w:tcBorders>
               <w:top w:val="single" w:color="C8C5BE" w:sz="1"/>
               <w:left w:val="single" w:color="C8C5BE" w:sz="1"/>
@@ -4752,7 +4752,7 @@
         </w:tc>
         <w:tc>
           <w:tcPr>
-            <w:tcW w:type="dxa" w:w="1531"/>
+            <w:tcW w:type="dxa" w:w="1533"/>
             <w:tcBorders>
               <w:top w:val="single" w:color="C8C5BE" w:sz="1"/>
               <w:left w:val="single" w:color="C8C5BE" w:sz="1"/>
@@ -4783,7 +4783,7 @@
         </w:trPr>
         <w:tc>
           <w:tcPr>
-            <w:tcW w:type="dxa" w:w="1705"/>
+            <w:tcW w:type="dxa" w:w="1707"/>
             <w:tcBorders>
               <w:top w:val="single" w:color="C8C5BE" w:sz="1"/>
               <w:left w:val="single" w:color="C8C5BE" w:sz="1"/>
@@ -4809,7 +4809,7 @@
         </w:tc>
         <w:tc>
           <w:tcPr>
-            <w:tcW w:type="dxa" w:w="1513"/>
+            <w:tcW w:type="dxa" w:w="1515"/>
             <w:tcBorders>
               <w:top w:val="single" w:color="C8C5BE" w:sz="1"/>
               <w:left w:val="single" w:color="C8C5BE" w:sz="1"/>
@@ -4835,7 +4835,7 @@
         </w:tc>
         <w:tc>
           <w:tcPr>
-            <w:tcW w:type="dxa" w:w="1246"/>
+            <w:tcW w:type="dxa" w:w="1235"/>
             <w:tcBorders>
               <w:top w:val="single" w:color="C8C5BE" w:sz="1"/>
               <w:left w:val="single" w:color="C8C5BE" w:sz="1"/>
@@ -4861,7 +4861,7 @@
         </w:tc>
         <w:tc>
           <w:tcPr>
-            <w:tcW w:type="dxa" w:w="1221"/>
+            <w:tcW w:type="dxa" w:w="1222"/>
             <w:tcBorders>
               <w:top w:val="single" w:color="C8C5BE" w:sz="1"/>
               <w:left w:val="single" w:color="C8C5BE" w:sz="1"/>
@@ -4887,7 +4887,7 @@
         </w:tc>
         <w:tc>
           <w:tcPr>
-            <w:tcW w:type="dxa" w:w="2864"/>
+            <w:tcW w:type="dxa" w:w="2868"/>
             <w:tcBorders>
               <w:top w:val="single" w:color="C8C5BE" w:sz="1"/>
               <w:left w:val="single" w:color="C8C5BE" w:sz="1"/>
@@ -4913,7 +4913,7 @@
         </w:tc>
         <w:tc>
           <w:tcPr>
-            <w:tcW w:type="dxa" w:w="1531"/>
+            <w:tcW w:type="dxa" w:w="1533"/>
             <w:tcBorders>
               <w:top w:val="single" w:color="C8C5BE" w:sz="1"/>
               <w:left w:val="single" w:color="C8C5BE" w:sz="1"/>
@@ -4944,7 +4944,7 @@
         </w:trPr>
         <w:tc>
           <w:tcPr>
-            <w:tcW w:type="dxa" w:w="1705"/>
+            <w:tcW w:type="dxa" w:w="1707"/>
             <w:tcBorders>
               <w:top w:val="single" w:color="C8C5BE" w:sz="1"/>
               <w:left w:val="single" w:color="C8C5BE" w:sz="1"/>
@@ -4970,7 +4970,7 @@
         </w:tc>
         <w:tc>
           <w:tcPr>
-            <w:tcW w:type="dxa" w:w="1513"/>
+            <w:tcW w:type="dxa" w:w="1515"/>
             <w:tcBorders>
               <w:top w:val="single" w:color="C8C5BE" w:sz="1"/>
               <w:left w:val="single" w:color="C8C5BE" w:sz="1"/>
@@ -4996,7 +4996,7 @@
         </w:tc>
         <w:tc>
           <w:tcPr>
-            <w:tcW w:type="dxa" w:w="1246"/>
+            <w:tcW w:type="dxa" w:w="1235"/>
             <w:tcBorders>
               <w:top w:val="single" w:color="C8C5BE" w:sz="1"/>
               <w:left w:val="single" w:color="C8C5BE" w:sz="1"/>
@@ -5022,7 +5022,7 @@
         </w:tc>
         <w:tc>
           <w:tcPr>
-            <w:tcW w:type="dxa" w:w="1221"/>
+            <w:tcW w:type="dxa" w:w="1222"/>
             <w:tcBorders>
               <w:top w:val="single" w:color="C8C5BE" w:sz="1"/>
               <w:left w:val="single" w:color="C8C5BE" w:sz="1"/>
@@ -5048,7 +5048,7 @@
         </w:tc>
         <w:tc>
           <w:tcPr>
-            <w:tcW w:type="dxa" w:w="2864"/>
+            <w:tcW w:type="dxa" w:w="2868"/>
             <w:tcBorders>
               <w:top w:val="single" w:color="C8C5BE" w:sz="1"/>
               <w:left w:val="single" w:color="C8C5BE" w:sz="1"/>
@@ -5074,7 +5074,7 @@
         </w:tc>
         <w:tc>
           <w:tcPr>
-            <w:tcW w:type="dxa" w:w="1531"/>
+            <w:tcW w:type="dxa" w:w="1533"/>
             <w:tcBorders>
               <w:top w:val="single" w:color="C8C5BE" w:sz="1"/>
               <w:left w:val="single" w:color="C8C5BE" w:sz="1"/>
@@ -5105,7 +5105,7 @@
         </w:trPr>
         <w:tc>
           <w:tcPr>
-            <w:tcW w:type="dxa" w:w="1705"/>
+            <w:tcW w:type="dxa" w:w="1707"/>
             <w:tcBorders>
               <w:top w:val="single" w:color="C8C5BE" w:sz="1"/>
               <w:left w:val="single" w:color="C8C5BE" w:sz="1"/>
@@ -5131,7 +5131,7 @@
         </w:tc>
         <w:tc>
           <w:tcPr>
-            <w:tcW w:type="dxa" w:w="1513"/>
+            <w:tcW w:type="dxa" w:w="1515"/>
             <w:tcBorders>
               <w:top w:val="single" w:color="C8C5BE" w:sz="1"/>
               <w:left w:val="single" w:color="C8C5BE" w:sz="1"/>
@@ -5157,7 +5157,7 @@
         </w:tc>
         <w:tc>
           <w:tcPr>
-            <w:tcW w:type="dxa" w:w="1246"/>
+            <w:tcW w:type="dxa" w:w="1235"/>
             <w:tcBorders>
               <w:top w:val="single" w:color="C8C5BE" w:sz="1"/>
               <w:left w:val="single" w:color="C8C5BE" w:sz="1"/>
@@ -5183,7 +5183,7 @@
         </w:tc>
         <w:tc>
           <w:tcPr>
-            <w:tcW w:type="dxa" w:w="1221"/>
+            <w:tcW w:type="dxa" w:w="1222"/>
             <w:tcBorders>
               <w:top w:val="single" w:color="C8C5BE" w:sz="1"/>
               <w:left w:val="single" w:color="C8C5BE" w:sz="1"/>
@@ -5209,7 +5209,7 @@
         </w:tc>
         <w:tc>
           <w:tcPr>
-            <w:tcW w:type="dxa" w:w="2864"/>
+            <w:tcW w:type="dxa" w:w="2868"/>
             <w:tcBorders>
               <w:top w:val="single" w:color="C8C5BE" w:sz="1"/>
               <w:left w:val="single" w:color="C8C5BE" w:sz="1"/>
@@ -5235,7 +5235,7 @@
         </w:tc>
         <w:tc>
           <w:tcPr>
-            <w:tcW w:type="dxa" w:w="1531"/>
+            <w:tcW w:type="dxa" w:w="1533"/>
             <w:tcBorders>
               <w:top w:val="single" w:color="C8C5BE" w:sz="1"/>
               <w:left w:val="single" w:color="C8C5BE" w:sz="1"/>
@@ -5266,7 +5266,7 @@
         </w:trPr>
         <w:tc>
           <w:tcPr>
-            <w:tcW w:type="dxa" w:w="1705"/>
+            <w:tcW w:type="dxa" w:w="1707"/>
             <w:tcBorders>
               <w:top w:val="single" w:color="C8C5BE" w:sz="1"/>
               <w:left w:val="single" w:color="C8C5BE" w:sz="1"/>
@@ -5292,7 +5292,7 @@
         </w:tc>
         <w:tc>
           <w:tcPr>
-            <w:tcW w:type="dxa" w:w="1513"/>
+            <w:tcW w:type="dxa" w:w="1515"/>
             <w:tcBorders>
               <w:top w:val="single" w:color="C8C5BE" w:sz="1"/>
               <w:left w:val="single" w:color="C8C5BE" w:sz="1"/>
@@ -5318,7 +5318,7 @@
         </w:tc>
         <w:tc>
           <w:tcPr>
-            <w:tcW w:type="dxa" w:w="1246"/>
+            <w:tcW w:type="dxa" w:w="1235"/>
             <w:tcBorders>
               <w:top w:val="single" w:color="C8C5BE" w:sz="1"/>
               <w:left w:val="single" w:color="C8C5BE" w:sz="1"/>
@@ -5344,7 +5344,7 @@
         </w:tc>
         <w:tc>
           <w:tcPr>
-            <w:tcW w:type="dxa" w:w="1221"/>
+            <w:tcW w:type="dxa" w:w="1222"/>
             <w:tcBorders>
               <w:top w:val="single" w:color="C8C5BE" w:sz="1"/>
               <w:left w:val="single" w:color="C8C5BE" w:sz="1"/>
@@ -5370,7 +5370,7 @@
         </w:tc>
         <w:tc>
           <w:tcPr>
-            <w:tcW w:type="dxa" w:w="2864"/>
+            <w:tcW w:type="dxa" w:w="2868"/>
             <w:tcBorders>
               <w:top w:val="single" w:color="C8C5BE" w:sz="1"/>
               <w:left w:val="single" w:color="C8C5BE" w:sz="1"/>
@@ -5396,7 +5396,7 @@
         </w:tc>
         <w:tc>
           <w:tcPr>
-            <w:tcW w:type="dxa" w:w="1531"/>
+            <w:tcW w:type="dxa" w:w="1533"/>
             <w:tcBorders>
               <w:top w:val="single" w:color="C8C5BE" w:sz="1"/>
               <w:left w:val="single" w:color="C8C5BE" w:sz="1"/>
@@ -5427,7 +5427,7 @@
         </w:trPr>
         <w:tc>
           <w:tcPr>
-            <w:tcW w:type="dxa" w:w="1705"/>
+            <w:tcW w:type="dxa" w:w="1707"/>
             <w:tcBorders>
               <w:top w:val="single" w:color="C8C5BE" w:sz="1"/>
               <w:left w:val="single" w:color="C8C5BE" w:sz="1"/>
@@ -5453,7 +5453,7 @@
         </w:tc>
         <w:tc>
           <w:tcPr>
-            <w:tcW w:type="dxa" w:w="1513"/>
+            <w:tcW w:type="dxa" w:w="1515"/>
             <w:tcBorders>
               <w:top w:val="single" w:color="C8C5BE" w:sz="1"/>
               <w:left w:val="single" w:color="C8C5BE" w:sz="1"/>
@@ -5479,7 +5479,7 @@
         </w:tc>
         <w:tc>
           <w:tcPr>
-            <w:tcW w:type="dxa" w:w="1246"/>
+            <w:tcW w:type="dxa" w:w="1235"/>
             <w:tcBorders>
               <w:top w:val="single" w:color="C8C5BE" w:sz="1"/>
               <w:left w:val="single" w:color="C8C5BE" w:sz="1"/>
@@ -5505,7 +5505,7 @@
         </w:tc>
         <w:tc>
           <w:tcPr>
-            <w:tcW w:type="dxa" w:w="1221"/>
+            <w:tcW w:type="dxa" w:w="1222"/>
             <w:tcBorders>
               <w:top w:val="single" w:color="C8C5BE" w:sz="1"/>
               <w:left w:val="single" w:color="C8C5BE" w:sz="1"/>
@@ -5531,7 +5531,7 @@
         </w:tc>
         <w:tc>
           <w:tcPr>
-            <w:tcW w:type="dxa" w:w="2864"/>
+            <w:tcW w:type="dxa" w:w="2868"/>
             <w:tcBorders>
               <w:top w:val="single" w:color="C8C5BE" w:sz="1"/>
               <w:left w:val="single" w:color="C8C5BE" w:sz="1"/>
@@ -5557,7 +5557,7 @@
         </w:tc>
         <w:tc>
           <w:tcPr>
-            <w:tcW w:type="dxa" w:w="1531"/>
+            <w:tcW w:type="dxa" w:w="1533"/>
             <w:tcBorders>
               <w:top w:val="single" w:color="C8C5BE" w:sz="1"/>
               <w:left w:val="single" w:color="C8C5BE" w:sz="1"/>
@@ -5588,7 +5588,7 @@
         </w:trPr>
         <w:tc>
           <w:tcPr>
-            <w:tcW w:type="dxa" w:w="1705"/>
+            <w:tcW w:type="dxa" w:w="1707"/>
             <w:tcBorders>
               <w:top w:val="single" w:color="C8C5BE" w:sz="1"/>
               <w:left w:val="single" w:color="C8C5BE" w:sz="1"/>
@@ -5614,7 +5614,7 @@
         </w:tc>
         <w:tc>
           <w:tcPr>
-            <w:tcW w:type="dxa" w:w="1513"/>
+            <w:tcW w:type="dxa" w:w="1515"/>
             <w:tcBorders>
               <w:top w:val="single" w:color="C8C5BE" w:sz="1"/>
               <w:left w:val="single" w:color="C8C5BE" w:sz="1"/>
@@ -5640,7 +5640,7 @@
         </w:tc>
         <w:tc>
           <w:tcPr>
-            <w:tcW w:type="dxa" w:w="1246"/>
+            <w:tcW w:type="dxa" w:w="1235"/>
             <w:tcBorders>
               <w:top w:val="single" w:color="C8C5BE" w:sz="1"/>
               <w:left w:val="single" w:color="C8C5BE" w:sz="1"/>
@@ -5666,7 +5666,7 @@
         </w:tc>
         <w:tc>
           <w:tcPr>
-            <w:tcW w:type="dxa" w:w="1221"/>
+            <w:tcW w:type="dxa" w:w="1222"/>
             <w:tcBorders>
               <w:top w:val="single" w:color="C8C5BE" w:sz="1"/>
               <w:left w:val="single" w:color="C8C5BE" w:sz="1"/>
@@ -5692,7 +5692,7 @@
         </w:tc>
         <w:tc>
           <w:tcPr>
-            <w:tcW w:type="dxa" w:w="2864"/>
+            <w:tcW w:type="dxa" w:w="2868"/>
             <w:tcBorders>
               <w:top w:val="single" w:color="C8C5BE" w:sz="1"/>
               <w:left w:val="single" w:color="C8C5BE" w:sz="1"/>
@@ -5718,7 +5718,7 @@
         </w:tc>
         <w:tc>
           <w:tcPr>
-            <w:tcW w:type="dxa" w:w="1531"/>
+            <w:tcW w:type="dxa" w:w="1533"/>
             <w:tcBorders>
               <w:top w:val="single" w:color="C8C5BE" w:sz="1"/>
               <w:left w:val="single" w:color="C8C5BE" w:sz="1"/>
@@ -5749,7 +5749,7 @@
         </w:trPr>
         <w:tc>
           <w:tcPr>
-            <w:tcW w:type="dxa" w:w="1705"/>
+            <w:tcW w:type="dxa" w:w="1707"/>
             <w:tcBorders>
               <w:top w:val="single" w:color="C8C5BE" w:sz="1"/>
               <w:left w:val="single" w:color="C8C5BE" w:sz="1"/>
@@ -5775,7 +5775,7 @@
         </w:tc>
         <w:tc>
           <w:tcPr>
-            <w:tcW w:type="dxa" w:w="1513"/>
+            <w:tcW w:type="dxa" w:w="1515"/>
             <w:tcBorders>
               <w:top w:val="single" w:color="C8C5BE" w:sz="1"/>
               <w:left w:val="single" w:color="C8C5BE" w:sz="1"/>
@@ -5801,7 +5801,7 @@
         </w:tc>
         <w:tc>
           <w:tcPr>
-            <w:tcW w:type="dxa" w:w="1246"/>
+            <w:tcW w:type="dxa" w:w="1235"/>
             <w:tcBorders>
               <w:top w:val="single" w:color="C8C5BE" w:sz="1"/>
               <w:left w:val="single" w:color="C8C5BE" w:sz="1"/>
@@ -5827,7 +5827,7 @@
         </w:tc>
         <w:tc>
           <w:tcPr>
-            <w:tcW w:type="dxa" w:w="1221"/>
+            <w:tcW w:type="dxa" w:w="1222"/>
             <w:tcBorders>
               <w:top w:val="single" w:color="C8C5BE" w:sz="1"/>
               <w:left w:val="single" w:color="C8C5BE" w:sz="1"/>
@@ -5853,7 +5853,7 @@
         </w:tc>
         <w:tc>
           <w:tcPr>
-            <w:tcW w:type="dxa" w:w="2864"/>
+            <w:tcW w:type="dxa" w:w="2868"/>
             <w:tcBorders>
               <w:top w:val="single" w:color="C8C5BE" w:sz="1"/>
               <w:left w:val="single" w:color="C8C5BE" w:sz="1"/>
@@ -5879,7 +5879,7 @@
         </w:tc>
         <w:tc>
           <w:tcPr>
-            <w:tcW w:type="dxa" w:w="1531"/>
+            <w:tcW w:type="dxa" w:w="1533"/>
             <w:tcBorders>
               <w:top w:val="single" w:color="C8C5BE" w:sz="1"/>
               <w:left w:val="single" w:color="C8C5BE" w:sz="1"/>
@@ -5910,7 +5910,7 @@
         </w:trPr>
         <w:tc>
           <w:tcPr>
-            <w:tcW w:type="dxa" w:w="1705"/>
+            <w:tcW w:type="dxa" w:w="1707"/>
             <w:tcBorders>
               <w:top w:val="single" w:color="C8C5BE" w:sz="1"/>
               <w:left w:val="single" w:color="C8C5BE" w:sz="1"/>
@@ -5936,7 +5936,7 @@
         </w:tc>
         <w:tc>
           <w:tcPr>
-            <w:tcW w:type="dxa" w:w="1513"/>
+            <w:tcW w:type="dxa" w:w="1515"/>
             <w:tcBorders>
               <w:top w:val="single" w:color="C8C5BE" w:sz="1"/>
               <w:left w:val="single" w:color="C8C5BE" w:sz="1"/>
@@ -5962,7 +5962,7 @@
         </w:tc>
         <w:tc>
           <w:tcPr>
-            <w:tcW w:type="dxa" w:w="1246"/>
+            <w:tcW w:type="dxa" w:w="1235"/>
             <w:tcBorders>
               <w:top w:val="single" w:color="C8C5BE" w:sz="1"/>
               <w:left w:val="single" w:color="C8C5BE" w:sz="1"/>
@@ -5988,7 +5988,7 @@
         </w:tc>
         <w:tc>
           <w:tcPr>
-            <w:tcW w:type="dxa" w:w="1221"/>
+            <w:tcW w:type="dxa" w:w="1222"/>
             <w:tcBorders>
               <w:top w:val="single" w:color="C8C5BE" w:sz="1"/>
               <w:left w:val="single" w:color="C8C5BE" w:sz="1"/>
@@ -6014,7 +6014,7 @@
         </w:tc>
         <w:tc>
           <w:tcPr>
-            <w:tcW w:type="dxa" w:w="2864"/>
+            <w:tcW w:type="dxa" w:w="2868"/>
             <w:tcBorders>
               <w:top w:val="single" w:color="C8C5BE" w:sz="1"/>
               <w:left w:val="single" w:color="C8C5BE" w:sz="1"/>
@@ -6040,7 +6040,7 @@
         </w:tc>
         <w:tc>
           <w:tcPr>
-            <w:tcW w:type="dxa" w:w="1531"/>
+            <w:tcW w:type="dxa" w:w="1533"/>
             <w:tcBorders>
               <w:top w:val="single" w:color="C8C5BE" w:sz="1"/>
               <w:left w:val="single" w:color="C8C5BE" w:sz="1"/>
@@ -6071,7 +6071,7 @@
         </w:trPr>
         <w:tc>
           <w:tcPr>
-            <w:tcW w:type="dxa" w:w="1705"/>
+            <w:tcW w:type="dxa" w:w="1707"/>
             <w:tcBorders>
               <w:top w:val="single" w:color="C8C5BE" w:sz="1"/>
               <w:left w:val="single" w:color="C8C5BE" w:sz="1"/>
@@ -6097,7 +6097,7 @@
         </w:tc>
         <w:tc>
           <w:tcPr>
-            <w:tcW w:type="dxa" w:w="1513"/>
+            <w:tcW w:type="dxa" w:w="1515"/>
             <w:tcBorders>
               <w:top w:val="single" w:color="C8C5BE" w:sz="1"/>
               <w:left w:val="single" w:color="C8C5BE" w:sz="1"/>
@@ -6123,7 +6123,7 @@
         </w:tc>
         <w:tc>
           <w:tcPr>
-            <w:tcW w:type="dxa" w:w="1246"/>
+            <w:tcW w:type="dxa" w:w="1235"/>
             <w:tcBorders>
               <w:top w:val="single" w:color="C8C5BE" w:sz="1"/>
               <w:left w:val="single" w:color="C8C5BE" w:sz="1"/>
@@ -6149,7 +6149,7 @@
         </w:tc>
         <w:tc>
           <w:tcPr>
-            <w:tcW w:type="dxa" w:w="1221"/>
+            <w:tcW w:type="dxa" w:w="1222"/>
             <w:tcBorders>
               <w:top w:val="single" w:color="C8C5BE" w:sz="1"/>
               <w:left w:val="single" w:color="C8C5BE" w:sz="1"/>
@@ -6175,7 +6175,7 @@
         </w:tc>
         <w:tc>
           <w:tcPr>
-            <w:tcW w:type="dxa" w:w="2864"/>
+            <w:tcW w:type="dxa" w:w="2868"/>
             <w:tcBorders>
               <w:top w:val="single" w:color="C8C5BE" w:sz="1"/>
               <w:left w:val="single" w:color="C8C5BE" w:sz="1"/>
@@ -6201,7 +6201,7 @@
         </w:tc>
         <w:tc>
           <w:tcPr>
-            <w:tcW w:type="dxa" w:w="1531"/>
+            <w:tcW w:type="dxa" w:w="1533"/>
             <w:tcBorders>
               <w:top w:val="single" w:color="C8C5BE" w:sz="1"/>
               <w:left w:val="single" w:color="C8C5BE" w:sz="1"/>
@@ -6232,7 +6232,7 @@
         </w:trPr>
         <w:tc>
           <w:tcPr>
-            <w:tcW w:type="dxa" w:w="1705"/>
+            <w:tcW w:type="dxa" w:w="1707"/>
             <w:tcBorders>
               <w:top w:val="single" w:color="C8C5BE" w:sz="1"/>
               <w:left w:val="single" w:color="C8C5BE" w:sz="1"/>
@@ -6258,7 +6258,7 @@
         </w:tc>
         <w:tc>
           <w:tcPr>
-            <w:tcW w:type="dxa" w:w="1513"/>
+            <w:tcW w:type="dxa" w:w="1515"/>
             <w:tcBorders>
               <w:top w:val="single" w:color="C8C5BE" w:sz="1"/>
               <w:left w:val="single" w:color="C8C5BE" w:sz="1"/>
@@ -6284,7 +6284,7 @@
         </w:tc>
         <w:tc>
           <w:tcPr>
-            <w:tcW w:type="dxa" w:w="1246"/>
+            <w:tcW w:type="dxa" w:w="1235"/>
             <w:tcBorders>
               <w:top w:val="single" w:color="C8C5BE" w:sz="1"/>
               <w:left w:val="single" w:color="C8C5BE" w:sz="1"/>
@@ -6310,7 +6310,7 @@
         </w:tc>
         <w:tc>
           <w:tcPr>
-            <w:tcW w:type="dxa" w:w="1221"/>
+            <w:tcW w:type="dxa" w:w="1222"/>
             <w:tcBorders>
               <w:top w:val="single" w:color="C8C5BE" w:sz="1"/>
               <w:left w:val="single" w:color="C8C5BE" w:sz="1"/>
@@ -6336,7 +6336,7 @@
         </w:tc>
         <w:tc>
           <w:tcPr>
-            <w:tcW w:type="dxa" w:w="2864"/>
+            <w:tcW w:type="dxa" w:w="2868"/>
             <w:tcBorders>
               <w:top w:val="single" w:color="C8C5BE" w:sz="1"/>
               <w:left w:val="single" w:color="C8C5BE" w:sz="1"/>
@@ -6362,7 +6362,7 @@
         </w:tc>
         <w:tc>
           <w:tcPr>
-            <w:tcW w:type="dxa" w:w="1531"/>
+            <w:tcW w:type="dxa" w:w="1533"/>
             <w:tcBorders>
               <w:top w:val="single" w:color="C8C5BE" w:sz="1"/>
               <w:left w:val="single" w:color="C8C5BE" w:sz="1"/>
@@ -6393,7 +6393,7 @@
         </w:trPr>
         <w:tc>
           <w:tcPr>
-            <w:tcW w:type="dxa" w:w="1705"/>
+            <w:tcW w:type="dxa" w:w="1707"/>
             <w:tcBorders>
               <w:top w:val="single" w:color="C8C5BE" w:sz="1"/>
               <w:left w:val="single" w:color="C8C5BE" w:sz="1"/>
@@ -6419,7 +6419,7 @@
         </w:tc>
         <w:tc>
           <w:tcPr>
-            <w:tcW w:type="dxa" w:w="1513"/>
+            <w:tcW w:type="dxa" w:w="1515"/>
             <w:tcBorders>
               <w:top w:val="single" w:color="C8C5BE" w:sz="1"/>
               <w:left w:val="single" w:color="C8C5BE" w:sz="1"/>
@@ -6445,7 +6445,7 @@
         </w:tc>
         <w:tc>
           <w:tcPr>
-            <w:tcW w:type="dxa" w:w="1246"/>
+            <w:tcW w:type="dxa" w:w="1235"/>
             <w:tcBorders>
               <w:top w:val="single" w:color="C8C5BE" w:sz="1"/>
               <w:left w:val="single" w:color="C8C5BE" w:sz="1"/>
@@ -6471,7 +6471,7 @@
         </w:tc>
         <w:tc>
           <w:tcPr>
-            <w:tcW w:type="dxa" w:w="1221"/>
+            <w:tcW w:type="dxa" w:w="1222"/>
             <w:tcBorders>
               <w:top w:val="single" w:color="C8C5BE" w:sz="1"/>
               <w:left w:val="single" w:color="C8C5BE" w:sz="1"/>
@@ -6497,7 +6497,7 @@
         </w:tc>
         <w:tc>
           <w:tcPr>
-            <w:tcW w:type="dxa" w:w="2864"/>
+            <w:tcW w:type="dxa" w:w="2868"/>
             <w:tcBorders>
               <w:top w:val="single" w:color="C8C5BE" w:sz="1"/>
               <w:left w:val="single" w:color="C8C5BE" w:sz="1"/>
@@ -6523,7 +6523,7 @@
         </w:tc>
         <w:tc>
           <w:tcPr>
-            <w:tcW w:type="dxa" w:w="1531"/>
+            <w:tcW w:type="dxa" w:w="1533"/>
             <w:tcBorders>
               <w:top w:val="single" w:color="C8C5BE" w:sz="1"/>
               <w:left w:val="single" w:color="C8C5BE" w:sz="1"/>
@@ -6554,7 +6554,7 @@
         </w:trPr>
         <w:tc>
           <w:tcPr>
-            <w:tcW w:type="dxa" w:w="1705"/>
+            <w:tcW w:type="dxa" w:w="1707"/>
             <w:tcBorders>
               <w:top w:val="single" w:color="C8C5BE" w:sz="1"/>
               <w:left w:val="single" w:color="C8C5BE" w:sz="1"/>
@@ -6580,7 +6580,7 @@
         </w:tc>
         <w:tc>
           <w:tcPr>
-            <w:tcW w:type="dxa" w:w="1513"/>
+            <w:tcW w:type="dxa" w:w="1515"/>
             <w:tcBorders>
               <w:top w:val="single" w:color="C8C5BE" w:sz="1"/>
               <w:left w:val="single" w:color="C8C5BE" w:sz="1"/>
@@ -6606,7 +6606,7 @@
         </w:tc>
         <w:tc>
           <w:tcPr>
-            <w:tcW w:type="dxa" w:w="1246"/>
+            <w:tcW w:type="dxa" w:w="1235"/>
             <w:tcBorders>
               <w:top w:val="single" w:color="C8C5BE" w:sz="1"/>
               <w:left w:val="single" w:color="C8C5BE" w:sz="1"/>
@@ -6632,7 +6632,7 @@
         </w:tc>
         <w:tc>
           <w:tcPr>
-            <w:tcW w:type="dxa" w:w="1221"/>
+            <w:tcW w:type="dxa" w:w="1222"/>
             <w:tcBorders>
               <w:top w:val="single" w:color="C8C5BE" w:sz="1"/>
               <w:left w:val="single" w:color="C8C5BE" w:sz="1"/>
@@ -6658,7 +6658,7 @@
         </w:tc>
         <w:tc>
           <w:tcPr>
-            <w:tcW w:type="dxa" w:w="2864"/>
+            <w:tcW w:type="dxa" w:w="2868"/>
             <w:tcBorders>
               <w:top w:val="single" w:color="C8C5BE" w:sz="1"/>
               <w:left w:val="single" w:color="C8C5BE" w:sz="1"/>
@@ -6684,7 +6684,7 @@
         </w:tc>
         <w:tc>
           <w:tcPr>
-            <w:tcW w:type="dxa" w:w="1531"/>
+            <w:tcW w:type="dxa" w:w="1533"/>
             <w:tcBorders>
               <w:top w:val="single" w:color="C8C5BE" w:sz="1"/>
               <w:left w:val="single" w:color="C8C5BE" w:sz="1"/>
@@ -6715,7 +6715,7 @@
         </w:trPr>
         <w:tc>
           <w:tcPr>
-            <w:tcW w:type="dxa" w:w="1705"/>
+            <w:tcW w:type="dxa" w:w="1707"/>
             <w:tcBorders>
               <w:top w:val="single" w:color="C8C5BE" w:sz="1"/>
               <w:left w:val="single" w:color="C8C5BE" w:sz="1"/>
@@ -6741,7 +6741,7 @@
         </w:tc>
         <w:tc>
           <w:tcPr>
-            <w:tcW w:type="dxa" w:w="1513"/>
+            <w:tcW w:type="dxa" w:w="1515"/>
             <w:tcBorders>
               <w:top w:val="single" w:color="C8C5BE" w:sz="1"/>
               <w:left w:val="single" w:color="C8C5BE" w:sz="1"/>
@@ -6767,7 +6767,7 @@
         </w:tc>
         <w:tc>
           <w:tcPr>
-            <w:tcW w:type="dxa" w:w="1246"/>
+            <w:tcW w:type="dxa" w:w="1235"/>
             <w:tcBorders>
               <w:top w:val="single" w:color="C8C5BE" w:sz="1"/>
               <w:left w:val="single" w:color="C8C5BE" w:sz="1"/>
@@ -6793,7 +6793,7 @@
         </w:tc>
         <w:tc>
           <w:tcPr>
-            <w:tcW w:type="dxa" w:w="1221"/>
+            <w:tcW w:type="dxa" w:w="1222"/>
             <w:tcBorders>
               <w:top w:val="single" w:color="C8C5BE" w:sz="1"/>
               <w:left w:val="single" w:color="C8C5BE" w:sz="1"/>
@@ -6819,7 +6819,7 @@
         </w:tc>
         <w:tc>
           <w:tcPr>
-            <w:tcW w:type="dxa" w:w="2864"/>
+            <w:tcW w:type="dxa" w:w="2868"/>
             <w:tcBorders>
               <w:top w:val="single" w:color="C8C5BE" w:sz="1"/>
               <w:left w:val="single" w:color="C8C5BE" w:sz="1"/>
@@ -6845,7 +6845,7 @@
         </w:tc>
         <w:tc>
           <w:tcPr>
-            <w:tcW w:type="dxa" w:w="1531"/>
+            <w:tcW w:type="dxa" w:w="1533"/>
             <w:tcBorders>
               <w:top w:val="single" w:color="C8C5BE" w:sz="1"/>
               <w:left w:val="single" w:color="C8C5BE" w:sz="1"/>
@@ -6876,7 +6876,7 @@
         </w:trPr>
         <w:tc>
           <w:tcPr>
-            <w:tcW w:type="dxa" w:w="1705"/>
+            <w:tcW w:type="dxa" w:w="1707"/>
             <w:tcBorders>
               <w:top w:val="single" w:color="C8C5BE" w:sz="1"/>
               <w:left w:val="single" w:color="C8C5BE" w:sz="1"/>
@@ -6902,7 +6902,7 @@
         </w:tc>
         <w:tc>
           <w:tcPr>
-            <w:tcW w:type="dxa" w:w="1513"/>
+            <w:tcW w:type="dxa" w:w="1515"/>
             <w:tcBorders>
               <w:top w:val="single" w:color="C8C5BE" w:sz="1"/>
               <w:left w:val="single" w:color="C8C5BE" w:sz="1"/>
@@ -6928,7 +6928,7 @@
         </w:tc>
         <w:tc>
           <w:tcPr>
-            <w:tcW w:type="dxa" w:w="1246"/>
+            <w:tcW w:type="dxa" w:w="1235"/>
             <w:tcBorders>
               <w:top w:val="single" w:color="C8C5BE" w:sz="1"/>
               <w:left w:val="single" w:color="C8C5BE" w:sz="1"/>
@@ -6954,7 +6954,7 @@
         </w:tc>
         <w:tc>
           <w:tcPr>
-            <w:tcW w:type="dxa" w:w="1221"/>
+            <w:tcW w:type="dxa" w:w="1222"/>
             <w:tcBorders>
               <w:top w:val="single" w:color="C8C5BE" w:sz="1"/>
               <w:left w:val="single" w:color="C8C5BE" w:sz="1"/>
@@ -6980,7 +6980,7 @@
         </w:tc>
         <w:tc>
           <w:tcPr>
-            <w:tcW w:type="dxa" w:w="2864"/>
+            <w:tcW w:type="dxa" w:w="2868"/>
             <w:tcBorders>
               <w:top w:val="single" w:color="C8C5BE" w:sz="1"/>
               <w:left w:val="single" w:color="C8C5BE" w:sz="1"/>
@@ -7006,7 +7006,7 @@
         </w:tc>
         <w:tc>
           <w:tcPr>
-            <w:tcW w:type="dxa" w:w="1531"/>
+            <w:tcW w:type="dxa" w:w="1533"/>
             <w:tcBorders>
               <w:top w:val="single" w:color="C8C5BE" w:sz="1"/>
               <w:left w:val="single" w:color="C8C5BE" w:sz="1"/>
@@ -7037,7 +7037,7 @@
         </w:trPr>
         <w:tc>
           <w:tcPr>
-            <w:tcW w:type="dxa" w:w="1705"/>
+            <w:tcW w:type="dxa" w:w="1707"/>
             <w:tcBorders>
               <w:top w:val="single" w:color="C8C5BE" w:sz="1"/>
               <w:left w:val="single" w:color="C8C5BE" w:sz="1"/>
@@ -7063,7 +7063,7 @@
         </w:tc>
         <w:tc>
           <w:tcPr>
-            <w:tcW w:type="dxa" w:w="1513"/>
+            <w:tcW w:type="dxa" w:w="1515"/>
             <w:tcBorders>
               <w:top w:val="single" w:color="C8C5BE" w:sz="1"/>
               <w:left w:val="single" w:color="C8C5BE" w:sz="1"/>
@@ -7089,7 +7089,7 @@
         </w:tc>
         <w:tc>
           <w:tcPr>
-            <w:tcW w:type="dxa" w:w="1246"/>
+            <w:tcW w:type="dxa" w:w="1235"/>
             <w:tcBorders>
               <w:top w:val="single" w:color="C8C5BE" w:sz="1"/>
               <w:left w:val="single" w:color="C8C5BE" w:sz="1"/>
@@ -7115,7 +7115,7 @@
         </w:tc>
         <w:tc>
           <w:tcPr>
-            <w:tcW w:type="dxa" w:w="1221"/>
+            <w:tcW w:type="dxa" w:w="1222"/>
             <w:tcBorders>
               <w:top w:val="single" w:color="C8C5BE" w:sz="1"/>
               <w:left w:val="single" w:color="C8C5BE" w:sz="1"/>
@@ -7141,7 +7141,7 @@
         </w:tc>
         <w:tc>
           <w:tcPr>
-            <w:tcW w:type="dxa" w:w="2864"/>
+            <w:tcW w:type="dxa" w:w="2868"/>
             <w:tcBorders>
               <w:top w:val="single" w:color="C8C5BE" w:sz="1"/>
               <w:left w:val="single" w:color="C8C5BE" w:sz="1"/>
@@ -7167,7 +7167,7 @@
         </w:tc>
         <w:tc>
           <w:tcPr>
-            <w:tcW w:type="dxa" w:w="1531"/>
+            <w:tcW w:type="dxa" w:w="1533"/>
             <w:tcBorders>
               <w:top w:val="single" w:color="C8C5BE" w:sz="1"/>
               <w:left w:val="single" w:color="C8C5BE" w:sz="1"/>
@@ -7198,7 +7198,7 @@
         </w:trPr>
         <w:tc>
           <w:tcPr>
-            <w:tcW w:type="dxa" w:w="1705"/>
+            <w:tcW w:type="dxa" w:w="1707"/>
             <w:tcBorders>
               <w:top w:val="single" w:color="C8C5BE" w:sz="1"/>
               <w:left w:val="single" w:color="C8C5BE" w:sz="1"/>
@@ -7224,7 +7224,7 @@
         </w:tc>
         <w:tc>
           <w:tcPr>
-            <w:tcW w:type="dxa" w:w="1513"/>
+            <w:tcW w:type="dxa" w:w="1515"/>
             <w:tcBorders>
               <w:top w:val="single" w:color="C8C5BE" w:sz="1"/>
               <w:left w:val="single" w:color="C8C5BE" w:sz="1"/>
@@ -7250,7 +7250,7 @@
         </w:tc>
         <w:tc>
           <w:tcPr>
-            <w:tcW w:type="dxa" w:w="1246"/>
+            <w:tcW w:type="dxa" w:w="1235"/>
             <w:tcBorders>
               <w:top w:val="single" w:color="C8C5BE" w:sz="1"/>
               <w:left w:val="single" w:color="C8C5BE" w:sz="1"/>
@@ -7276,7 +7276,7 @@
         </w:tc>
         <w:tc>
           <w:tcPr>
-            <w:tcW w:type="dxa" w:w="1221"/>
+            <w:tcW w:type="dxa" w:w="1222"/>
             <w:tcBorders>
               <w:top w:val="single" w:color="C8C5BE" w:sz="1"/>
               <w:left w:val="single" w:color="C8C5BE" w:sz="1"/>
@@ -7302,7 +7302,7 @@
         </w:tc>
         <w:tc>
           <w:tcPr>
-            <w:tcW w:type="dxa" w:w="2864"/>
+            <w:tcW w:type="dxa" w:w="2868"/>
             <w:tcBorders>
               <w:top w:val="single" w:color="C8C5BE" w:sz="1"/>
               <w:left w:val="single" w:color="C8C5BE" w:sz="1"/>
@@ -7328,7 +7328,7 @@
         </w:tc>
         <w:tc>
           <w:tcPr>
-            <w:tcW w:type="dxa" w:w="1531"/>
+            <w:tcW w:type="dxa" w:w="1533"/>
             <w:tcBorders>
               <w:top w:val="single" w:color="C8C5BE" w:sz="1"/>
               <w:left w:val="single" w:color="C8C5BE" w:sz="1"/>
@@ -7359,7 +7359,7 @@
         </w:trPr>
         <w:tc>
           <w:tcPr>
-            <w:tcW w:type="dxa" w:w="1705"/>
+            <w:tcW w:type="dxa" w:w="1707"/>
             <w:tcBorders>
               <w:top w:val="single" w:color="C8C5BE" w:sz="1"/>
               <w:left w:val="single" w:color="C8C5BE" w:sz="1"/>
@@ -7385,111 +7385,111 @@
         </w:tc>
         <w:tc>
           <w:tcPr>
-            <w:tcW w:type="dxa" w:w="1513"/>
-            <w:tcBorders>
-              <w:top w:val="single" w:color="C8C5BE" w:sz="1"/>
-              <w:left w:val="single" w:color="C8C5BE" w:sz="1"/>
-              <w:bottom w:val="single" w:color="C8C5BE" w:sz="1"/>
-              <w:right w:val="single" w:color="C8C5BE" w:sz="1"/>
-            </w:tcBorders>
-            <w:tcMar>
-              <w:top w:type="dxa" w:w="50"/>
-              <w:left w:type="dxa" w:w="90"/>
-              <w:bottom w:type="dxa" w:w="50"/>
-              <w:right w:type="dxa" w:w="90"/>
-            </w:tcMar>
-          </w:tcPr>
-          <w:p>
-            <w:r>
-              <w:rPr>
-                <w:sz w:val="16"/>
-                <w:szCs w:val="16"/>
-              </w:rPr>
-              <w:t xml:space="preserve">9e6c62c9 / 268ed81b</w:t>
-            </w:r>
-          </w:p>
-        </w:tc>
-        <w:tc>
-          <w:tcPr>
-            <w:tcW w:type="dxa" w:w="1246"/>
-            <w:tcBorders>
-              <w:top w:val="single" w:color="C8C5BE" w:sz="1"/>
-              <w:left w:val="single" w:color="C8C5BE" w:sz="1"/>
-              <w:bottom w:val="single" w:color="C8C5BE" w:sz="1"/>
-              <w:right w:val="single" w:color="C8C5BE" w:sz="1"/>
-            </w:tcBorders>
-            <w:tcMar>
-              <w:top w:type="dxa" w:w="50"/>
-              <w:left w:type="dxa" w:w="90"/>
-              <w:bottom w:type="dxa" w:w="50"/>
-              <w:right w:type="dxa" w:w="90"/>
-            </w:tcMar>
-          </w:tcPr>
-          <w:p>
-            <w:r>
-              <w:rPr>
-                <w:sz w:val="16"/>
-                <w:szCs w:val="16"/>
-              </w:rPr>
-              <w:t xml:space="preserve">APPROVE / RC</w:t>
-            </w:r>
-          </w:p>
-        </w:tc>
-        <w:tc>
-          <w:tcPr>
-            <w:tcW w:type="dxa" w:w="1221"/>
-            <w:tcBorders>
-              <w:top w:val="single" w:color="C8C5BE" w:sz="1"/>
-              <w:left w:val="single" w:color="C8C5BE" w:sz="1"/>
-              <w:bottom w:val="single" w:color="C8C5BE" w:sz="1"/>
-              <w:right w:val="single" w:color="C8C5BE" w:sz="1"/>
-            </w:tcBorders>
-            <w:tcMar>
-              <w:top w:type="dxa" w:w="50"/>
-              <w:left w:type="dxa" w:w="90"/>
-              <w:bottom w:type="dxa" w:w="50"/>
-              <w:right w:type="dxa" w:w="90"/>
-            </w:tcMar>
-          </w:tcPr>
-          <w:p>
-            <w:r>
-              <w:rPr>
-                <w:sz w:val="16"/>
-                <w:szCs w:val="16"/>
-              </w:rPr>
-              <w:t xml:space="preserve">RC / RC</w:t>
-            </w:r>
-          </w:p>
-        </w:tc>
-        <w:tc>
-          <w:tcPr>
-            <w:tcW w:type="dxa" w:w="2864"/>
-            <w:tcBorders>
-              <w:top w:val="single" w:color="C8C5BE" w:sz="1"/>
-              <w:left w:val="single" w:color="C8C5BE" w:sz="1"/>
-              <w:bottom w:val="single" w:color="C8C5BE" w:sz="1"/>
-              <w:right w:val="single" w:color="C8C5BE" w:sz="1"/>
-            </w:tcBorders>
-            <w:tcMar>
-              <w:top w:type="dxa" w:w="50"/>
-              <w:left w:type="dxa" w:w="90"/>
-              <w:bottom w:type="dxa" w:w="50"/>
-              <w:right w:type="dxa" w:w="90"/>
-            </w:tcMar>
-          </w:tcPr>
-          <w:p>
-            <w:r>
-              <w:rPr>
-                <w:sz w:val="16"/>
-                <w:szCs w:val="16"/>
-              </w:rPr>
-              <w:t xml:space="preserve">#634 round 5 (B-634-10 finite error-class enum in safeLogDiagnostic); #325 B-325-4 copy "we"</w:t>
-            </w:r>
-          </w:p>
-        </w:tc>
-        <w:tc>
-          <w:tcPr>
-            <w:tcW w:type="dxa" w:w="1531"/>
+            <w:tcW w:type="dxa" w:w="1515"/>
+            <w:tcBorders>
+              <w:top w:val="single" w:color="C8C5BE" w:sz="1"/>
+              <w:left w:val="single" w:color="C8C5BE" w:sz="1"/>
+              <w:bottom w:val="single" w:color="C8C5BE" w:sz="1"/>
+              <w:right w:val="single" w:color="C8C5BE" w:sz="1"/>
+            </w:tcBorders>
+            <w:tcMar>
+              <w:top w:type="dxa" w:w="50"/>
+              <w:left w:type="dxa" w:w="90"/>
+              <w:bottom w:type="dxa" w:w="50"/>
+              <w:right w:type="dxa" w:w="90"/>
+            </w:tcMar>
+          </w:tcPr>
+          <w:p>
+            <w:r>
+              <w:rPr>
+                <w:sz w:val="16"/>
+                <w:szCs w:val="16"/>
+              </w:rPr>
+              <w:t xml:space="preserve">9e6c62c9 / 7566d38f</w:t>
+            </w:r>
+          </w:p>
+        </w:tc>
+        <w:tc>
+          <w:tcPr>
+            <w:tcW w:type="dxa" w:w="1235"/>
+            <w:tcBorders>
+              <w:top w:val="single" w:color="C8C5BE" w:sz="1"/>
+              <w:left w:val="single" w:color="C8C5BE" w:sz="1"/>
+              <w:bottom w:val="single" w:color="C8C5BE" w:sz="1"/>
+              <w:right w:val="single" w:color="C8C5BE" w:sz="1"/>
+            </w:tcBorders>
+            <w:tcMar>
+              <w:top w:type="dxa" w:w="50"/>
+              <w:left w:type="dxa" w:w="90"/>
+              <w:bottom w:type="dxa" w:w="50"/>
+              <w:right w:type="dxa" w:w="90"/>
+            </w:tcMar>
+          </w:tcPr>
+          <w:p>
+            <w:r>
+              <w:rPr>
+                <w:sz w:val="16"/>
+                <w:szCs w:val="16"/>
+              </w:rPr>
+              <w:t xml:space="preserve">APPROVE / –</w:t>
+            </w:r>
+          </w:p>
+        </w:tc>
+        <w:tc>
+          <w:tcPr>
+            <w:tcW w:type="dxa" w:w="1222"/>
+            <w:tcBorders>
+              <w:top w:val="single" w:color="C8C5BE" w:sz="1"/>
+              <w:left w:val="single" w:color="C8C5BE" w:sz="1"/>
+              <w:bottom w:val="single" w:color="C8C5BE" w:sz="1"/>
+              <w:right w:val="single" w:color="C8C5BE" w:sz="1"/>
+            </w:tcBorders>
+            <w:tcMar>
+              <w:top w:type="dxa" w:w="50"/>
+              <w:left w:type="dxa" w:w="90"/>
+              <w:bottom w:type="dxa" w:w="50"/>
+              <w:right w:type="dxa" w:w="90"/>
+            </w:tcMar>
+          </w:tcPr>
+          <w:p>
+            <w:r>
+              <w:rPr>
+                <w:sz w:val="16"/>
+                <w:szCs w:val="16"/>
+              </w:rPr>
+              <w:t xml:space="preserve">RC / –</w:t>
+            </w:r>
+          </w:p>
+        </w:tc>
+        <w:tc>
+          <w:tcPr>
+            <w:tcW w:type="dxa" w:w="2868"/>
+            <w:tcBorders>
+              <w:top w:val="single" w:color="C8C5BE" w:sz="1"/>
+              <w:left w:val="single" w:color="C8C5BE" w:sz="1"/>
+              <w:bottom w:val="single" w:color="C8C5BE" w:sz="1"/>
+              <w:right w:val="single" w:color="C8C5BE" w:sz="1"/>
+            </w:tcBorders>
+            <w:tcMar>
+              <w:top w:type="dxa" w:w="50"/>
+              <w:left w:type="dxa" w:w="90"/>
+              <w:bottom w:type="dxa" w:w="50"/>
+              <w:right w:type="dxa" w:w="90"/>
+            </w:tcMar>
+          </w:tcPr>
+          <w:p>
+            <w:r>
+              <w:rPr>
+                <w:sz w:val="16"/>
+                <w:szCs w:val="16"/>
+              </w:rPr>
+              <w:t xml:space="preserve">#634 round 5 (B-634-10 finite error-class enum in safeLogDiagnostic). #325 FIX ROUND 5 done by operator 114 at 21:53 (B-325-4 closed, main 4f1d74d8 merged, full jest 6244/6244): needs Opus + Sol delta only (comment 5965763539)</w:t>
+            </w:r>
+          </w:p>
+        </w:tc>
+        <w:tc>
+          <w:tcPr>
+            <w:tcW w:type="dxa" w:w="1533"/>
             <w:tcBorders>
               <w:top w:val="single" w:color="C8C5BE" w:sz="1"/>
               <w:left w:val="single" w:color="C8C5BE" w:sz="1"/>
@@ -7520,7 +7520,7 @@
         </w:trPr>
         <w:tc>
           <w:tcPr>
-            <w:tcW w:type="dxa" w:w="1705"/>
+            <w:tcW w:type="dxa" w:w="1707"/>
             <w:tcBorders>
               <w:top w:val="single" w:color="C8C5BE" w:sz="1"/>
               <w:left w:val="single" w:color="C8C5BE" w:sz="1"/>
@@ -7546,7 +7546,7 @@
         </w:tc>
         <w:tc>
           <w:tcPr>
-            <w:tcW w:type="dxa" w:w="1513"/>
+            <w:tcW w:type="dxa" w:w="1515"/>
             <w:tcBorders>
               <w:top w:val="single" w:color="C8C5BE" w:sz="1"/>
               <w:left w:val="single" w:color="C8C5BE" w:sz="1"/>
@@ -7572,7 +7572,7 @@
         </w:tc>
         <w:tc>
           <w:tcPr>
-            <w:tcW w:type="dxa" w:w="1246"/>
+            <w:tcW w:type="dxa" w:w="1235"/>
             <w:tcBorders>
               <w:top w:val="single" w:color="C8C5BE" w:sz="1"/>
               <w:left w:val="single" w:color="C8C5BE" w:sz="1"/>
@@ -7598,7 +7598,7 @@
         </w:tc>
         <w:tc>
           <w:tcPr>
-            <w:tcW w:type="dxa" w:w="1221"/>
+            <w:tcW w:type="dxa" w:w="1222"/>
             <w:tcBorders>
               <w:top w:val="single" w:color="C8C5BE" w:sz="1"/>
               <w:left w:val="single" w:color="C8C5BE" w:sz="1"/>
@@ -7624,7 +7624,7 @@
         </w:tc>
         <w:tc>
           <w:tcPr>
-            <w:tcW w:type="dxa" w:w="2864"/>
+            <w:tcW w:type="dxa" w:w="2868"/>
             <w:tcBorders>
               <w:top w:val="single" w:color="C8C5BE" w:sz="1"/>
               <w:left w:val="single" w:color="C8C5BE" w:sz="1"/>
@@ -7650,7 +7650,7 @@
         </w:tc>
         <w:tc>
           <w:tcPr>
-            <w:tcW w:type="dxa" w:w="1531"/>
+            <w:tcW w:type="dxa" w:w="1533"/>
             <w:tcBorders>
               <w:top w:val="single" w:color="C8C5BE" w:sz="1"/>
               <w:left w:val="single" w:color="C8C5BE" w:sz="1"/>
@@ -7681,7 +7681,7 @@
         </w:trPr>
         <w:tc>
           <w:tcPr>
-            <w:tcW w:type="dxa" w:w="1705"/>
+            <w:tcW w:type="dxa" w:w="1707"/>
             <w:tcBorders>
               <w:top w:val="single" w:color="C8C5BE" w:sz="1"/>
               <w:left w:val="single" w:color="C8C5BE" w:sz="1"/>
@@ -7707,7 +7707,7 @@
         </w:tc>
         <w:tc>
           <w:tcPr>
-            <w:tcW w:type="dxa" w:w="1513"/>
+            <w:tcW w:type="dxa" w:w="1515"/>
             <w:tcBorders>
               <w:top w:val="single" w:color="C8C5BE" w:sz="1"/>
               <w:left w:val="single" w:color="C8C5BE" w:sz="1"/>
@@ -7733,7 +7733,7 @@
         </w:tc>
         <w:tc>
           <w:tcPr>
-            <w:tcW w:type="dxa" w:w="1246"/>
+            <w:tcW w:type="dxa" w:w="1235"/>
             <w:tcBorders>
               <w:top w:val="single" w:color="C8C5BE" w:sz="1"/>
               <w:left w:val="single" w:color="C8C5BE" w:sz="1"/>
@@ -7759,7 +7759,7 @@
         </w:tc>
         <w:tc>
           <w:tcPr>
-            <w:tcW w:type="dxa" w:w="1221"/>
+            <w:tcW w:type="dxa" w:w="1222"/>
             <w:tcBorders>
               <w:top w:val="single" w:color="C8C5BE" w:sz="1"/>
               <w:left w:val="single" w:color="C8C5BE" w:sz="1"/>
@@ -7785,7 +7785,7 @@
         </w:tc>
         <w:tc>
           <w:tcPr>
-            <w:tcW w:type="dxa" w:w="2864"/>
+            <w:tcW w:type="dxa" w:w="2868"/>
             <w:tcBorders>
               <w:top w:val="single" w:color="C8C5BE" w:sz="1"/>
               <w:left w:val="single" w:color="C8C5BE" w:sz="1"/>
@@ -7811,7 +7811,7 @@
         </w:tc>
         <w:tc>
           <w:tcPr>
-            <w:tcW w:type="dxa" w:w="1531"/>
+            <w:tcW w:type="dxa" w:w="1533"/>
             <w:tcBorders>
               <w:top w:val="single" w:color="C8C5BE" w:sz="1"/>
               <w:left w:val="single" w:color="C8C5BE" w:sz="1"/>
@@ -7842,7 +7842,7 @@
         </w:trPr>
         <w:tc>
           <w:tcPr>
-            <w:tcW w:type="dxa" w:w="1705"/>
+            <w:tcW w:type="dxa" w:w="1707"/>
             <w:tcBorders>
               <w:top w:val="single" w:color="C8C5BE" w:sz="1"/>
               <w:left w:val="single" w:color="C8C5BE" w:sz="1"/>
@@ -7868,7 +7868,7 @@
         </w:tc>
         <w:tc>
           <w:tcPr>
-            <w:tcW w:type="dxa" w:w="1513"/>
+            <w:tcW w:type="dxa" w:w="1515"/>
             <w:tcBorders>
               <w:top w:val="single" w:color="C8C5BE" w:sz="1"/>
               <w:left w:val="single" w:color="C8C5BE" w:sz="1"/>
@@ -7894,7 +7894,7 @@
         </w:tc>
         <w:tc>
           <w:tcPr>
-            <w:tcW w:type="dxa" w:w="1246"/>
+            <w:tcW w:type="dxa" w:w="1235"/>
             <w:tcBorders>
               <w:top w:val="single" w:color="C8C5BE" w:sz="1"/>
               <w:left w:val="single" w:color="C8C5BE" w:sz="1"/>
@@ -7920,7 +7920,7 @@
         </w:tc>
         <w:tc>
           <w:tcPr>
-            <w:tcW w:type="dxa" w:w="1221"/>
+            <w:tcW w:type="dxa" w:w="1222"/>
             <w:tcBorders>
               <w:top w:val="single" w:color="C8C5BE" w:sz="1"/>
               <w:left w:val="single" w:color="C8C5BE" w:sz="1"/>
@@ -7946,7 +7946,7 @@
         </w:tc>
         <w:tc>
           <w:tcPr>
-            <w:tcW w:type="dxa" w:w="2864"/>
+            <w:tcW w:type="dxa" w:w="2868"/>
             <w:tcBorders>
               <w:top w:val="single" w:color="C8C5BE" w:sz="1"/>
               <w:left w:val="single" w:color="C8C5BE" w:sz="1"/>
@@ -7972,7 +7972,7 @@
         </w:tc>
         <w:tc>
           <w:tcPr>
-            <w:tcW w:type="dxa" w:w="1531"/>
+            <w:tcW w:type="dxa" w:w="1533"/>
             <w:tcBorders>
               <w:top w:val="single" w:color="C8C5BE" w:sz="1"/>
               <w:left w:val="single" w:color="C8C5BE" w:sz="1"/>
@@ -8003,7 +8003,7 @@
         </w:trPr>
         <w:tc>
           <w:tcPr>
-            <w:tcW w:type="dxa" w:w="1705"/>
+            <w:tcW w:type="dxa" w:w="1707"/>
             <w:tcBorders>
               <w:top w:val="single" w:color="C8C5BE" w:sz="1"/>
               <w:left w:val="single" w:color="C8C5BE" w:sz="1"/>
@@ -8029,7 +8029,7 @@
         </w:tc>
         <w:tc>
           <w:tcPr>
-            <w:tcW w:type="dxa" w:w="1513"/>
+            <w:tcW w:type="dxa" w:w="1515"/>
             <w:tcBorders>
               <w:top w:val="single" w:color="C8C5BE" w:sz="1"/>
               <w:left w:val="single" w:color="C8C5BE" w:sz="1"/>
@@ -8055,7 +8055,7 @@
         </w:tc>
         <w:tc>
           <w:tcPr>
-            <w:tcW w:type="dxa" w:w="1246"/>
+            <w:tcW w:type="dxa" w:w="1235"/>
             <w:tcBorders>
               <w:top w:val="single" w:color="C8C5BE" w:sz="1"/>
               <w:left w:val="single" w:color="C8C5BE" w:sz="1"/>
@@ -8081,7 +8081,7 @@
         </w:tc>
         <w:tc>
           <w:tcPr>
-            <w:tcW w:type="dxa" w:w="1221"/>
+            <w:tcW w:type="dxa" w:w="1222"/>
             <w:tcBorders>
               <w:top w:val="single" w:color="C8C5BE" w:sz="1"/>
               <w:left w:val="single" w:color="C8C5BE" w:sz="1"/>
@@ -8107,7 +8107,7 @@
         </w:tc>
         <w:tc>
           <w:tcPr>
-            <w:tcW w:type="dxa" w:w="2864"/>
+            <w:tcW w:type="dxa" w:w="2868"/>
             <w:tcBorders>
               <w:top w:val="single" w:color="C8C5BE" w:sz="1"/>
               <w:left w:val="single" w:color="C8C5BE" w:sz="1"/>
@@ -8133,7 +8133,7 @@
         </w:tc>
         <w:tc>
           <w:tcPr>
-            <w:tcW w:type="dxa" w:w="1531"/>
+            <w:tcW w:type="dxa" w:w="1533"/>
             <w:tcBorders>
               <w:top w:val="single" w:color="C8C5BE" w:sz="1"/>
               <w:left w:val="single" w:color="C8C5BE" w:sz="1"/>
@@ -8164,7 +8164,7 @@
         </w:trPr>
         <w:tc>
           <w:tcPr>
-            <w:tcW w:type="dxa" w:w="1705"/>
+            <w:tcW w:type="dxa" w:w="1707"/>
             <w:tcBorders>
               <w:top w:val="single" w:color="C8C5BE" w:sz="1"/>
               <w:left w:val="single" w:color="C8C5BE" w:sz="1"/>
@@ -8190,7 +8190,7 @@
         </w:tc>
         <w:tc>
           <w:tcPr>
-            <w:tcW w:type="dxa" w:w="1513"/>
+            <w:tcW w:type="dxa" w:w="1515"/>
             <w:tcBorders>
               <w:top w:val="single" w:color="C8C5BE" w:sz="1"/>
               <w:left w:val="single" w:color="C8C5BE" w:sz="1"/>
@@ -8216,7 +8216,7 @@
         </w:tc>
         <w:tc>
           <w:tcPr>
-            <w:tcW w:type="dxa" w:w="1246"/>
+            <w:tcW w:type="dxa" w:w="1235"/>
             <w:tcBorders>
               <w:top w:val="single" w:color="C8C5BE" w:sz="1"/>
               <w:left w:val="single" w:color="C8C5BE" w:sz="1"/>
@@ -8242,7 +8242,7 @@
         </w:tc>
         <w:tc>
           <w:tcPr>
-            <w:tcW w:type="dxa" w:w="1221"/>
+            <w:tcW w:type="dxa" w:w="1222"/>
             <w:tcBorders>
               <w:top w:val="single" w:color="C8C5BE" w:sz="1"/>
               <w:left w:val="single" w:color="C8C5BE" w:sz="1"/>
@@ -8268,7 +8268,7 @@
         </w:tc>
         <w:tc>
           <w:tcPr>
-            <w:tcW w:type="dxa" w:w="2864"/>
+            <w:tcW w:type="dxa" w:w="2868"/>
             <w:tcBorders>
               <w:top w:val="single" w:color="C8C5BE" w:sz="1"/>
               <w:left w:val="single" w:color="C8C5BE" w:sz="1"/>
@@ -8294,7 +8294,7 @@
         </w:tc>
         <w:tc>
           <w:tcPr>
-            <w:tcW w:type="dxa" w:w="1531"/>
+            <w:tcW w:type="dxa" w:w="1533"/>
             <w:tcBorders>
               <w:top w:val="single" w:color="C8C5BE" w:sz="1"/>
               <w:left w:val="single" w:color="C8C5BE" w:sz="1"/>
@@ -8356,7 +8356,7 @@
         <w:spacing w:after="60"/>
       </w:pPr>
       <w:r>
-        <w:t xml:space="preserve">Builders (Claude Opus 5.5), most critical first: #627 (B-627-9 narrowed); #654 + #334 as one lane; #628; #641; #656; #648. Then 114-S's mobile chain (#326 → #315 → #305 → #317 → #325) and #634 → #651, either in a revived sub-manager session or as your lanes.</w:t>
+        <w:t xml:space="preserve">Builders (Claude Opus 5.5), most critical first: #627 (B-627-9 narrowed); #654 + #334 as one lane; #628; #641; #656; #648. Then 114-S's mobile chain (#326 → #315 → #305 → #317 → #325; #325 needs only lens deltas at 7566d38f) and #634 → #651, either in a revived sub-manager session or as your lanes.</w:t>
       </w:r>
     </w:p>
     <w:p>
@@ -8714,6 +8714,19 @@
       </w:pPr>
       <w:r>
         <w:t xml:space="preserve">Issue #662 restore-without-resurrection (no production restore until built).</w:t>
+      </w:r>
+    </w:p>
+    <w:p>
+      <w:pPr>
+        <w:pStyle w:val="ListParagraph"/>
+        <w:numPr>
+          <w:ilvl w:val="0"/>
+          <w:numId w:val="2"/>
+        </w:numPr>
+        <w:spacing w:after="60"/>
+      </w:pPr>
+      <w:r>
+        <w:t xml:space="preserve">Main-wide copy sweep: first-person error copy that predates the rule remains on mobile main (src/lib/inviteAttachOutcome.ts, src/lib/intendedRole.ts, src/utils/authFailure.ts, src/utils/authErrorMessage.ts, src/components/invite/PasteInviteCodeButton.tsx, src/components/community/ChallengeProgressSheet.tsx). One small mobile lane with a repo-wide voice guard test.</w:t>
       </w:r>
     </w:p>
     <w:p>

</xml_diff>